<commit_message>
Update DevOpsSec CA Brief 2026.docx
</commit_message>
<xml_diff>
--- a/DevOpsSec CA Brief 2026.docx
+++ b/DevOpsSec CA Brief 2026.docx
@@ -466,7 +466,6 @@
             <w:r>
               <w:t>(</w:t>
             </w:r>
-            <w:proofErr w:type="gramStart"/>
             <w:r>
               <w:rPr>
                 <w:color w:val="0462C1"/>
@@ -481,11 +480,7 @@
               <w:t xml:space="preserve"> </w:t>
             </w:r>
             <w:r>
-              <w:t>)</w:t>
-            </w:r>
-            <w:proofErr w:type="gramEnd"/>
-            <w:r>
-              <w:t xml:space="preserve">. </w:t>
+              <w:t xml:space="preserve">). </w:t>
             </w:r>
           </w:p>
           <w:p>
@@ -858,12 +853,8 @@
     <w:p>
       <w:pPr>
         <w:spacing w:after="35" w:line="259" w:lineRule="auto"/>
-        <w:ind w:left="674" w:firstLine="0"/>
         <w:jc w:val="left"/>
       </w:pPr>
-      <w:r>
-        <w:t xml:space="preserve"> </w:t>
-      </w:r>
     </w:p>
     <w:p>
       <w:pPr>
@@ -925,12 +916,8 @@
     <w:p>
       <w:pPr>
         <w:spacing w:after="37" w:line="259" w:lineRule="auto"/>
-        <w:ind w:left="1394" w:firstLine="0"/>
         <w:jc w:val="left"/>
       </w:pPr>
-      <w:r>
-        <w:t xml:space="preserve"> </w:t>
-      </w:r>
     </w:p>
     <w:p>
       <w:pPr>
@@ -5327,15 +5314,6 @@
 </file>
 
 <file path=customXml/item1.xml><?xml version="1.0" encoding="utf-8"?>
-<?mso-contentType ?>
-<FormTemplates xmlns="http://schemas.microsoft.com/sharepoint/v3/contenttype/forms">
-  <Display>DocumentLibraryForm</Display>
-  <Edit>DocumentLibraryForm</Edit>
-  <New>DocumentLibraryForm</New>
-</FormTemplates>
-</file>
-
-<file path=customXml/item2.xml><?xml version="1.0" encoding="utf-8"?>
 <ct:contentTypeSchema xmlns:ct="http://schemas.microsoft.com/office/2006/metadata/contentType" xmlns:ma="http://schemas.microsoft.com/office/2006/metadata/properties/metaAttributes" ct:_="" ma:_="" ma:contentTypeName="Document" ma:contentTypeID="0x0101002B0323D027E5954AAB464BA8822B8C89" ma:contentTypeVersion="14" ma:contentTypeDescription="Create a new document." ma:contentTypeScope="" ma:versionID="1cf018210431b84f564240d8ccbf4aa0">
   <xsd:schema xmlns:xsd="http://www.w3.org/2001/XMLSchema" xmlns:xs="http://www.w3.org/2001/XMLSchema" xmlns:p="http://schemas.microsoft.com/office/2006/metadata/properties" xmlns:ns2="197ffb74-2fa2-4efa-b24f-1c08924ed9de" xmlns:ns3="31e6fc8c-be7e-4e09-af27-c0e4189a4671" targetNamespace="http://schemas.microsoft.com/office/2006/metadata/properties" ma:root="true" ma:fieldsID="11c5d3ff5436a067b49bd4a1d2aae97a" ns2:_="" ns3:_="">
     <xsd:import namespace="197ffb74-2fa2-4efa-b24f-1c08924ed9de"/>
@@ -5565,6 +5543,15 @@
 </ct:contentTypeSchema>
 </file>
 
+<file path=customXml/item2.xml><?xml version="1.0" encoding="utf-8"?>
+<?mso-contentType ?>
+<FormTemplates xmlns="http://schemas.microsoft.com/sharepoint/v3/contenttype/forms">
+  <Display>DocumentLibraryForm</Display>
+  <Edit>DocumentLibraryForm</Edit>
+  <New>DocumentLibraryForm</New>
+</FormTemplates>
+</file>
+
 <file path=customXml/item3.xml><?xml version="1.0" encoding="utf-8"?>
 <p:properties xmlns:p="http://schemas.microsoft.com/office/2006/metadata/properties" xmlns:xsi="http://www.w3.org/2001/XMLSchema-instance" xmlns:pc="http://schemas.microsoft.com/office/infopath/2007/PartnerControls">
   <documentManagement>
@@ -5579,14 +5566,6 @@
 </file>
 
 <file path=customXml/itemProps1.xml><?xml version="1.0" encoding="utf-8"?>
-<ds:datastoreItem xmlns:ds="http://schemas.openxmlformats.org/officeDocument/2006/customXml" ds:itemID="{E8C4F4FE-1DE8-498D-A0F4-FDB100C001C7}">
-  <ds:schemaRefs>
-    <ds:schemaRef ds:uri="http://schemas.microsoft.com/sharepoint/v3/contenttype/forms"/>
-  </ds:schemaRefs>
-</ds:datastoreItem>
-</file>
-
-<file path=customXml/itemProps2.xml><?xml version="1.0" encoding="utf-8"?>
 <ds:datastoreItem xmlns:ds="http://schemas.openxmlformats.org/officeDocument/2006/customXml" ds:itemID="{ECA4D146-EE1E-4DBE-98EB-C3628D5BC63F}">
   <ds:schemaRefs>
     <ds:schemaRef ds:uri="http://schemas.microsoft.com/office/2006/metadata/contentType"/>
@@ -5605,6 +5584,14 @@
 </ds:datastoreItem>
 </file>
 
+<file path=customXml/itemProps2.xml><?xml version="1.0" encoding="utf-8"?>
+<ds:datastoreItem xmlns:ds="http://schemas.openxmlformats.org/officeDocument/2006/customXml" ds:itemID="{E8C4F4FE-1DE8-498D-A0F4-FDB100C001C7}">
+  <ds:schemaRefs>
+    <ds:schemaRef ds:uri="http://schemas.microsoft.com/sharepoint/v3/contenttype/forms"/>
+  </ds:schemaRefs>
+</ds:datastoreItem>
+</file>
+
 <file path=customXml/itemProps3.xml><?xml version="1.0" encoding="utf-8"?>
 <ds:datastoreItem xmlns:ds="http://schemas.openxmlformats.org/officeDocument/2006/customXml" ds:itemID="{75200578-A48F-49AE-B98B-BA8268BA2D97}">
   <ds:schemaRefs>

</xml_diff>